<commit_message>
finnish working on onlab beszamolo
</commit_message>
<xml_diff>
--- a/BFK4J4_Onlab1.docx
+++ b/BFK4J4_Onlab1.docx
@@ -1079,7 +1079,7 @@
           </mc:Choice>
           <mc:Fallback>
             <w:pict>
-              <v:group w14:anchorId="062473AD" id="Csoportba foglalás 10" o:spid="_x0000_s1026" style="position:absolute;margin-left:48.3pt;margin-top:74pt;width:385.35pt;height:216.75pt;z-index:251662848;mso-width-relative:margin;mso-height-relative:margin" coordsize="48939,27527" o:gfxdata="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">
+              <v:group w14:anchorId="3E8B375A" id="Csoportba foglalás 10" o:spid="_x0000_s1026" style="position:absolute;margin-left:48.3pt;margin-top:74pt;width:385.35pt;height:216.75pt;z-index:251662848;mso-width-relative:margin;mso-height-relative:margin" coordsize="48939,27527" o:gfxdata="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">
                 <v:shapetype id="_x0000_t75" coordsize="21600,21600" o:spt="75" o:preferrelative="t" path="m@4@5l@4@11@9@11@9@5xe" filled="f" stroked="f">
                   <v:stroke joinstyle="miter"/>
                   <v:formulas>
@@ -1274,7 +1274,7 @@
         <mc:AlternateContent>
           <mc:Choice Requires="wps">
             <w:drawing>
-              <wp:anchor distT="0" distB="0" distL="114300" distR="114300" simplePos="0" relativeHeight="251665920" behindDoc="0" locked="0" layoutInCell="1" allowOverlap="1" wp14:anchorId="62C387A3" wp14:editId="5564620A">
+              <wp:anchor distT="0" distB="0" distL="114300" distR="114300" simplePos="0" relativeHeight="251658240" behindDoc="0" locked="0" layoutInCell="1" allowOverlap="1" wp14:anchorId="62C387A3" wp14:editId="5564620A">
                 <wp:simplePos x="0" y="0"/>
                 <wp:positionH relativeFrom="column">
                   <wp:posOffset>745490</wp:posOffset>
@@ -1337,7 +1337,10 @@
                             </w:r>
                             <w:bookmarkEnd w:id="4"/>
                             <w:r>
-                              <w:t xml:space="preserve"> Projekt feladatok Github Issue-ban</w:t>
+                              <w:t xml:space="preserve"> Projekt feladatok GitH</w:t>
+                            </w:r>
+                            <w:r>
+                              <w:t>ub Issue-ban</w:t>
                             </w:r>
                           </w:p>
                         </w:txbxContent>
@@ -1356,7 +1359,7 @@
           </mc:Choice>
           <mc:Fallback>
             <w:pict>
-              <v:shape w14:anchorId="62C387A3" id="Szövegdoboz 12" o:spid="_x0000_s1027" type="#_x0000_t202" style="position:absolute;left:0;text-align:left;margin-left:58.7pt;margin-top:346.55pt;width:364.5pt;height:.05pt;z-index:251665920;visibility:visible;mso-wrap-style:square;mso-wrap-distance-left:9pt;mso-wrap-distance-top:0;mso-wrap-distance-right:9pt;mso-wrap-distance-bottom:0;mso-position-horizontal:absolute;mso-position-horizontal-relative:text;mso-position-vertical:absolute;mso-position-vertical-relative:text;v-text-anchor:top" o:gfxdata="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" stroked="f">
+              <v:shape w14:anchorId="62C387A3" id="Szövegdoboz 12" o:spid="_x0000_s1027" type="#_x0000_t202" style="position:absolute;left:0;text-align:left;margin-left:58.7pt;margin-top:346.55pt;width:364.5pt;height:.05pt;z-index:251658240;visibility:visible;mso-wrap-style:square;mso-wrap-distance-left:9pt;mso-wrap-distance-top:0;mso-wrap-distance-right:9pt;mso-wrap-distance-bottom:0;mso-position-horizontal:absolute;mso-position-horizontal-relative:text;mso-position-vertical:absolute;mso-position-vertical-relative:text;v-text-anchor:top" o:gfxdata="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" stroked="f">
                 <v:textbox style="mso-fit-shape-to-text:t" inset="0,0,0,0">
                   <w:txbxContent>
                     <w:bookmarkStart w:id="5" w:name="_Ref229346516"/>
@@ -1388,7 +1391,10 @@
                       </w:r>
                       <w:bookmarkEnd w:id="5"/>
                       <w:r>
-                        <w:t xml:space="preserve"> Projekt feladatok Github Issue-ban</w:t>
+                        <w:t xml:space="preserve"> Projekt feladatok GitH</w:t>
+                      </w:r>
+                      <w:r>
+                        <w:t>ub Issue-ban</w:t>
                       </w:r>
                     </w:p>
                   </w:txbxContent>
@@ -1411,7 +1417,7 @@
           <w:lang w:eastAsia="hu-HU" w:bidi="ar-SA"/>
         </w:rPr>
         <w:drawing>
-          <wp:anchor distT="0" distB="0" distL="114300" distR="114300" simplePos="0" relativeHeight="251663872" behindDoc="0" locked="0" layoutInCell="1" allowOverlap="1" wp14:anchorId="0095D029" wp14:editId="2B22554B">
+          <wp:anchor distT="0" distB="0" distL="114300" distR="114300" simplePos="0" relativeHeight="251655168" behindDoc="0" locked="0" layoutInCell="1" allowOverlap="1" wp14:anchorId="0095D029" wp14:editId="2B22554B">
             <wp:simplePos x="0" y="0"/>
             <wp:positionH relativeFrom="margin">
               <wp:align>center</wp:align>
@@ -1548,7 +1554,7 @@
         <mc:AlternateContent>
           <mc:Choice Requires="wps">
             <w:drawing>
-              <wp:anchor distT="0" distB="0" distL="114300" distR="114300" simplePos="0" relativeHeight="251673088" behindDoc="0" locked="0" layoutInCell="1" allowOverlap="1" wp14:anchorId="26DCDDF3" wp14:editId="644951DD">
+              <wp:anchor distT="0" distB="0" distL="114300" distR="114300" simplePos="0" relativeHeight="251664384" behindDoc="0" locked="0" layoutInCell="1" allowOverlap="1" wp14:anchorId="26DCDDF3" wp14:editId="644951DD">
                 <wp:simplePos x="0" y="0"/>
                 <wp:positionH relativeFrom="column">
                   <wp:posOffset>0</wp:posOffset>
@@ -1616,7 +1622,10 @@
                             </w:r>
                             <w:bookmarkEnd w:id="6"/>
                             <w:r>
-                              <w:t xml:space="preserve"> Projekt feladatok Github Projects-ben</w:t>
+                              <w:t xml:space="preserve"> Projekt feladatok GitH</w:t>
+                            </w:r>
+                            <w:r>
+                              <w:t>ub Projects-ben</w:t>
                             </w:r>
                           </w:p>
                         </w:txbxContent>
@@ -1635,7 +1644,7 @@
           </mc:Choice>
           <mc:Fallback>
             <w:pict>
-              <v:shape w14:anchorId="26DCDDF3" id="Szövegdoboz 14" o:spid="_x0000_s1028" type="#_x0000_t202" style="position:absolute;left:0;text-align:left;margin-left:0;margin-top:312.9pt;width:481.9pt;height:.05pt;z-index:251673088;visibility:visible;mso-wrap-style:square;mso-wrap-distance-left:9pt;mso-wrap-distance-top:0;mso-wrap-distance-right:9pt;mso-wrap-distance-bottom:0;mso-position-horizontal:absolute;mso-position-horizontal-relative:text;mso-position-vertical:absolute;mso-position-vertical-relative:text;v-text-anchor:top" o:gfxdata="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" stroked="f">
+              <v:shape w14:anchorId="26DCDDF3" id="Szövegdoboz 14" o:spid="_x0000_s1028" type="#_x0000_t202" style="position:absolute;left:0;text-align:left;margin-left:0;margin-top:312.9pt;width:481.9pt;height:.05pt;z-index:251664384;visibility:visible;mso-wrap-style:square;mso-wrap-distance-left:9pt;mso-wrap-distance-top:0;mso-wrap-distance-right:9pt;mso-wrap-distance-bottom:0;mso-position-horizontal:absolute;mso-position-horizontal-relative:text;mso-position-vertical:absolute;mso-position-vertical-relative:text;v-text-anchor:top" o:gfxdata="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" stroked="f">
                 <v:textbox style="mso-fit-shape-to-text:t" inset="0,0,0,0">
                   <w:txbxContent>
                     <w:bookmarkStart w:id="7" w:name="_Ref229347829"/>
@@ -1672,7 +1681,10 @@
                       </w:r>
                       <w:bookmarkEnd w:id="7"/>
                       <w:r>
-                        <w:t xml:space="preserve"> Projekt feladatok Github Projects-ben</w:t>
+                        <w:t xml:space="preserve"> Projekt feladatok GitH</w:t>
+                      </w:r>
+                      <w:r>
+                        <w:t>ub Projects-ben</w:t>
                       </w:r>
                     </w:p>
                   </w:txbxContent>
@@ -1689,7 +1701,7 @@
           <w:lang w:eastAsia="hu-HU" w:bidi="ar-SA"/>
         </w:rPr>
         <w:drawing>
-          <wp:anchor distT="0" distB="0" distL="114300" distR="114300" simplePos="0" relativeHeight="251666944" behindDoc="0" locked="0" layoutInCell="1" allowOverlap="1" wp14:anchorId="687A5D52" wp14:editId="4CD35873">
+          <wp:anchor distT="0" distB="0" distL="114300" distR="114300" simplePos="0" relativeHeight="251661312" behindDoc="0" locked="0" layoutInCell="1" allowOverlap="1" wp14:anchorId="687A5D52" wp14:editId="4CD35873">
             <wp:simplePos x="0" y="0"/>
             <wp:positionH relativeFrom="margin">
               <wp:align>center</wp:align>
@@ -1865,9 +1877,12 @@
           <w:rPr>
             <w:rStyle w:val="Hiperhivatkozs"/>
           </w:rPr>
-          <w:t>következő fejezetben</w:t>
+          <w:t>2.2</w:t>
         </w:r>
       </w:hyperlink>
+      <w:r>
+        <w:t>-es fejezetben</w:t>
+      </w:r>
       <w:r>
         <w:t xml:space="preserve"> írok részletesebben.</w:t>
       </w:r>
@@ -1969,10 +1984,7 @@
         <w:ind w:left="567" w:firstLine="142"/>
       </w:pPr>
       <w:r>
-        <w:t>A Docker-alapú konténerizáció során célom az volt, hogy a korábban Windows környezetben, lokálisan futó backend komponenseket Docker környezetbe migráljam. A backend három fő részből állt: egy PostgreSQL adatbázisból, egy Python alapú FastAPI szolgáltatásból, valamint egy .NE</w:t>
-      </w:r>
-      <w:r>
-        <w:t>T Core Web API szolgáltatásból.</w:t>
+        <w:t>A Docker-alapú konténerizáció során célom az volt, hogy a korábban Windows környezetben, lokálisan futó backend komponenseket Docker környezetbe migráljam. A backend három fő részből állt: egy PostgreSQL adatbázisból, egy Python alapú FastAPI szolgáltatásból, valamint egy .NET Core Web API szolgáltatásból.</w:t>
       </w:r>
     </w:p>
     <w:p>
@@ -1993,10 +2005,7 @@
         <w:t>compose.yml fájlok elkészítése -</w:t>
       </w:r>
       <w:r>
-        <w:t xml:space="preserve"> után a projekt buildelése és indítása jelentősen leegyszerűsödött, gyakorlatilag egyetlen parancs kiadásával elvégezhetővé vált. Másrészt a Docker platformfüggetlen működése lehetővé teszi, hogy a konténerek bármilyen számítógépen ugyanúgy működjenek, amennyiben a Docker telepítve van. Ezzel elkerülhető az a tipikus probléma, amikor egy alkalmazás az egyik gépen megfelelően működik, míg egy másik környezetben különböző konfigurációs elté</w:t>
-      </w:r>
-      <w:r>
-        <w:t>rések miatt hibák jelentkeznek.</w:t>
+        <w:t xml:space="preserve"> után a projekt buildelése és indítása jelentősen leegyszerűsödött, gyakorlatilag egyetlen parancs kiadásával elvégezhetővé vált. Másrészt a Docker platformfüggetlen működése lehetővé teszi, hogy a konténerek bármilyen számítógépen ugyanúgy működjenek, amennyiben a Docker telepítve van. Ezzel elkerülhető az a tipikus probléma, amikor egy alkalmazás az egyik gépen megfelelően működik, míg egy másik környezetben különböző konfigurációs eltérések miatt hibák jelentkeznek.</w:t>
       </w:r>
     </w:p>
     <w:p>
@@ -2015,10 +2024,10 @@
       </w:pPr>
       <w:r>
         <w:object w:dxaOrig="9072" w:dyaOrig="13706" w14:anchorId="252DF6F5">
-          <v:shape id="_x0000_i1044" type="#_x0000_t75" style="width:453.6pt;height:640.05pt" o:ole="">
+          <v:shape id="_x0000_i1025" type="#_x0000_t75" style="width:453.6pt;height:640.05pt" o:ole="">
             <v:imagedata r:id="rId12" o:title=""/>
           </v:shape>
-          <o:OLEObject Type="Embed" ProgID="Word.OpenDocumentText.12" ShapeID="_x0000_i1044" DrawAspect="Content" ObjectID="_1839968277" r:id="rId13"/>
+          <o:OLEObject Type="Embed" ProgID="Word.OpenDocumentText.12" ShapeID="_x0000_i1025" DrawAspect="Content" ObjectID="_1840009594" r:id="rId13"/>
         </w:object>
       </w:r>
     </w:p>
@@ -2070,10 +2079,10 @@
       </w:pPr>
       <w:r>
         <w:object w:dxaOrig="9072" w:dyaOrig="12870" w14:anchorId="72849913">
-          <v:shape id="_x0000_i1054" type="#_x0000_t75" style="width:453.6pt;height:643.5pt" o:ole="">
+          <v:shape id="_x0000_i1026" type="#_x0000_t75" style="width:453.6pt;height:643.5pt" o:ole="">
             <v:imagedata r:id="rId14" o:title=""/>
           </v:shape>
-          <o:OLEObject Type="Embed" ProgID="Word.OpenDocumentText.12" ShapeID="_x0000_i1054" DrawAspect="Content" ObjectID="_1839968278" r:id="rId15"/>
+          <o:OLEObject Type="Embed" ProgID="Word.OpenDocumentText.12" ShapeID="_x0000_i1026" DrawAspect="Content" ObjectID="_1840009595" r:id="rId15"/>
         </w:object>
       </w:r>
     </w:p>
@@ -2176,10 +2185,7 @@
         <w:ind w:left="567" w:firstLine="142"/>
       </w:pPr>
       <w:r>
-        <w:t>A fejlesztői és az éles Dockerfile-ok között a legfontosabb különbség az volt, hogy a fejlesztői verzió hot reload mechanizmust alkalmazott a gyorsabb fejlesztés érdekében. A .NET Core szolgáltatás esetében ez automatikus újrafordítást és újraindítást jelentett módosítás esetén, míg az éles Dockerfile kizárólag a végleges DLL állományokat készítette el. A Python alapú FastAPI szolgáltatás esetében az éles környezetben egyszerűen a FastAPI szerver indult e</w:t>
-      </w:r>
-      <w:r>
-        <w:t>l, hot reload támogatás nélkül.</w:t>
+        <w:t>A fejlesztői és az éles Dockerfile-ok között a legfontosabb különbség az volt, hogy a fejlesztői verzió hot reload mechanizmust alkalmazott a gyorsabb fejlesztés érdekében. A .NET Core szolgáltatás esetében ez automatikus újrafordítást és újraindítást jelentett módosítás esetén, míg az éles Dockerfile kizárólag a végleges DLL állományokat készítette el. A Python alapú FastAPI szolgáltatás esetében az éles környezetben egyszerűen a FastAPI szerver indult el, hot reload támogatás nélkül.</w:t>
       </w:r>
     </w:p>
     <w:p>
@@ -2188,21 +2194,24 @@
         <w:ind w:left="567" w:firstLine="142"/>
       </w:pPr>
       <w:r>
-        <w:t xml:space="preserve">A két docker-compose konfiguráció között szintén jelentős különbségek voltak. A fejlesztői környezethez tartozó konfiguráció szükség esetén automatikusan buildelte az image-eket, míg az éles környezet már a dokumentum </w:t>
+        <w:t>A két docker-</w:t>
+      </w:r>
+      <w:r>
+        <w:t xml:space="preserve">compose konfiguráció között szintén jelentős különbségek voltak. A fejlesztői környezethez tartozó konfiguráció szükség esetén automatikusan buildelte az image-eket, míg az éles környezet már a dokumentum </w:t>
       </w:r>
       <w:hyperlink w:anchor="_2.3.2_Docker_konténerek" w:history="1">
         <w:r>
           <w:rPr>
             <w:rStyle w:val="Hiperhivatkozs"/>
           </w:rPr>
-          <w:t>későbbi részében</w:t>
+          <w:t>2.3.2</w:t>
         </w:r>
       </w:hyperlink>
       <w:r>
-        <w:t xml:space="preserve"> ismertetett GitHub Container Registry-ből töltötte le az előre elkészített image-eket. Emellett a fejlesztői környezetben a konténerek publikálták a szükséges portokat, valamint bind mountokat használtak annak érdekében, hogy a fájlrendszerbeli változások közvetlenül</w:t>
-      </w:r>
-      <w:r>
-        <w:t xml:space="preserve"> tükröződjenek a konténerekben.</w:t>
+        <w:t>-es pontjában</w:t>
+      </w:r>
+      <w:r>
+        <w:t xml:space="preserve"> ismertetett GitHub Container Registry-ből töltötte le az előre elkészített image-eket. Emellett a fejlesztői környezetben a konténerek publikálták a szükséges portokat, valamint bind mountokat használtak annak érdekében, hogy a fájlrendszerbeli változások közvetlenül tükröződjenek a konténerekben.</w:t>
       </w:r>
     </w:p>
     <w:p>
@@ -2226,13 +2235,7 @@
       <w:bookmarkStart w:id="13" w:name="_2.3.2_Docker_konténerek"/>
       <w:bookmarkEnd w:id="13"/>
       <w:r>
-        <w:t>2.3.2</w:t>
-      </w:r>
-      <w:r>
-        <w:t xml:space="preserve"> </w:t>
-      </w:r>
-      <w:r>
-        <w:t>Docker konténerek CI/CD pipline-ba integrálása</w:t>
+        <w:t>2.3.2 Docker konténerek CI/CD pipline-ba integrálása</w:t>
       </w:r>
     </w:p>
     <w:p>
@@ -2240,6 +2243,627 @@
         <w:pStyle w:val="Szvegtrzs"/>
         <w:ind w:left="567" w:firstLine="142"/>
       </w:pPr>
+      <w:r>
+        <w:t>Az agilitással foglalkozó szakirodalmak egyik fontos alapelve, hogy a legfőbb prioritás az ügyfél igényeinek kielégítése a működő szoftver minél korábbi átadásával, valamint annak folyamatos és rendszeres szállításával. Emellett az agilis szemlélet szerint a fejlesztés előrehaladásának legfontosabb mérőszáma maga a működő szoftver.</w:t>
+      </w:r>
+      <w:sdt>
+        <w:sdtPr>
+          <w:id w:val="635143942"/>
+          <w:citation/>
+        </w:sdtPr>
+        <w:sdtContent>
+          <w:r>
+            <w:fldChar w:fldCharType="begin"/>
+          </w:r>
+          <w:r>
+            <w:instrText xml:space="preserve"> CITATION Agi26 \l 1038 </w:instrText>
+          </w:r>
+          <w:r>
+            <w:fldChar w:fldCharType="separate"/>
+          </w:r>
+          <w:r>
+            <w:rPr>
+              <w:noProof/>
+            </w:rPr>
+            <w:t xml:space="preserve"> </w:t>
+          </w:r>
+          <w:r>
+            <w:rPr>
+              <w:noProof/>
+            </w:rPr>
+            <w:t>[1]</w:t>
+          </w:r>
+          <w:r>
+            <w:fldChar w:fldCharType="end"/>
+          </w:r>
+        </w:sdtContent>
+      </w:sdt>
+      <w:r>
+        <w:t xml:space="preserve"> Ennek a követelménynek szerettem volna megfelelni, ezért elkezdtem kialakítani egy GitHub-alapú CI/CD pipel</w:t>
+      </w:r>
+      <w:r>
+        <w:t>ine-t.</w:t>
+      </w:r>
+    </w:p>
+    <w:p>
+      <w:pPr>
+        <w:pStyle w:val="Szvegtrzs"/>
+        <w:keepNext/>
+        <w:ind w:left="567" w:firstLine="142"/>
+      </w:pPr>
+      <w:r>
+        <w:t>Mivel a projekt verziókezelésére GitHubot használtam, olyan forrásokat kerestem, amelyek részletesen ismertetik a CI/CD megközelítés gyakorlati alkalmazását Git-alapú fejlesztési környezetben. A GitLab dokumentációja részletesen bemutatja a CI/CD szemlélet lényegét, amely röviden úgy foglalható össze, mint a buildelés, tesztelés és telepítés automatizálása a gyorsabb és megbízhatóbb szoftverszállítás érdekében.</w:t>
+      </w:r>
+      <w:sdt>
+        <w:sdtPr>
+          <w:id w:val="2135746605"/>
+          <w:citation/>
+        </w:sdtPr>
+        <w:sdtContent>
+          <w:r>
+            <w:fldChar w:fldCharType="begin"/>
+          </w:r>
+          <w:r>
+            <w:instrText xml:space="preserve"> CITATION Git26 \l 1038 </w:instrText>
+          </w:r>
+          <w:r>
+            <w:fldChar w:fldCharType="separate"/>
+          </w:r>
+          <w:r>
+            <w:rPr>
+              <w:noProof/>
+            </w:rPr>
+            <w:t xml:space="preserve"> </w:t>
+          </w:r>
+          <w:r>
+            <w:rPr>
+              <w:noProof/>
+            </w:rPr>
+            <w:t>[2]</w:t>
+          </w:r>
+          <w:r>
+            <w:fldChar w:fldCharType="end"/>
+          </w:r>
+        </w:sdtContent>
+      </w:sdt>
+      <w:r>
+        <w:t xml:space="preserve"> GitHub környezetben ez elsősorban GitHub Actions workflow-k és branch protection szabályok alkalm</w:t>
+      </w:r>
+      <w:r>
+        <w:t>azását jelenti.</w:t>
+      </w:r>
+      <w:bookmarkStart w:id="14" w:name="_MON_1840001783"/>
+      <w:bookmarkEnd w:id="14"/>
+      <w:r>
+        <w:object w:dxaOrig="9072" w:dyaOrig="9765" w14:anchorId="5F0CBDF6">
+          <v:shape id="_x0000_i1034" type="#_x0000_t75" style="width:453.6pt;height:488.25pt" o:ole="">
+            <v:imagedata r:id="rId16" o:title=""/>
+          </v:shape>
+          <o:OLEObject Type="Embed" ProgID="Word.OpenDocumentText.12" ShapeID="_x0000_i1034" DrawAspect="Content" ObjectID="_1840009596" r:id="rId17"/>
+        </w:object>
+      </w:r>
+    </w:p>
+    <w:bookmarkStart w:id="15" w:name="_Ref229390003"/>
+    <w:p>
+      <w:pPr>
+        <w:pStyle w:val="Kpalrs"/>
+        <w:jc w:val="center"/>
+      </w:pPr>
+      <w:r>
+        <w:fldChar w:fldCharType="begin"/>
+      </w:r>
+      <w:r>
+        <w:instrText xml:space="preserve"> SEQ ábra \* ARABIC </w:instrText>
+      </w:r>
+      <w:r>
+        <w:fldChar w:fldCharType="separate"/>
+      </w:r>
+      <w:r>
+        <w:rPr>
+          <w:noProof/>
+        </w:rPr>
+        <w:t>6</w:t>
+      </w:r>
+      <w:r>
+        <w:fldChar w:fldCharType="end"/>
+      </w:r>
+      <w:r>
+        <w:t>. ábra</w:t>
+      </w:r>
+      <w:bookmarkEnd w:id="15"/>
+      <w:r>
+        <w:t xml:space="preserve"> Fejlesztői</w:t>
+      </w:r>
+      <w:r>
+        <w:t xml:space="preserve"> környezet</w:t>
+      </w:r>
+      <w:r>
+        <w:t xml:space="preserve"> GitHub Actions workflow</w:t>
+      </w:r>
+      <w:r>
+        <w:t xml:space="preserve"> részletei</w:t>
+      </w:r>
+    </w:p>
+    <w:p/>
+    <w:p>
+      <w:pPr>
+        <w:pStyle w:val="Szvegtrzs"/>
+        <w:keepNext/>
+        <w:ind w:left="567" w:firstLine="142"/>
+      </w:pPr>
+      <w:r>
+        <w:t>A projekt során három GitHub Actions workflow-t készítettem a CI/CD folyamat támogatására. Az el</w:t>
+      </w:r>
+      <w:r>
+        <w:t xml:space="preserve">ső workflow részleteit a </w:t>
+      </w:r>
+      <w:r>
+        <w:fldChar w:fldCharType="begin"/>
+      </w:r>
+      <w:r>
+        <w:instrText xml:space="preserve"> REF _Ref229390003 \h </w:instrText>
+      </w:r>
+      <w:r>
+        <w:fldChar w:fldCharType="separate"/>
+      </w:r>
+      <w:r>
+        <w:rPr>
+          <w:noProof/>
+        </w:rPr>
+        <w:t>6</w:t>
+      </w:r>
+      <w:r>
+        <w:t>. ábra</w:t>
+      </w:r>
+      <w:r>
+        <w:fldChar w:fldCharType="end"/>
+      </w:r>
+      <w:r>
+        <w:t xml:space="preserve"> mutatja. Ez a szkript a development branchre történő pusholáskor fut le, és több ellenőrzést végez: buildeli a .NET Core backend szolgáltatást, szintaktikai ellenőrzést futtat a Python-alapú szolgáltatáson, valamint ellenőrzi, hogy a Docker image-ek sikeresen buildelhetők-e. Ezt a pipeline-szakaszt azért hoztam létre, hogy a fejlesztők minden push után azonnali visszajelzést kapjanak arról, hogy a projekt buildelhető-e, és hiba esetén gyorsan</w:t>
+      </w:r>
+      <w:r>
+        <w:t xml:space="preserve"> javítani tudják a problémákat.</w:t>
+      </w:r>
+      <w:bookmarkStart w:id="16" w:name="_MON_1840003540"/>
+      <w:bookmarkEnd w:id="16"/>
+      <w:r>
+        <w:object w:dxaOrig="9072" w:dyaOrig="12135" w14:anchorId="18598820">
+          <v:shape id="_x0000_i1043" type="#_x0000_t75" style="width:453.6pt;height:606.75pt" o:ole="">
+            <v:imagedata r:id="rId18" o:title=""/>
+          </v:shape>
+          <o:OLEObject Type="Embed" ProgID="Word.OpenDocumentText.12" ShapeID="_x0000_i1043" DrawAspect="Content" ObjectID="_1840009597" r:id="rId19"/>
+        </w:object>
+      </w:r>
+    </w:p>
+    <w:bookmarkStart w:id="17" w:name="_Ref229390995"/>
+    <w:p>
+      <w:pPr>
+        <w:pStyle w:val="Kpalrs"/>
+        <w:jc w:val="center"/>
+      </w:pPr>
+      <w:r>
+        <w:fldChar w:fldCharType="begin"/>
+      </w:r>
+      <w:r>
+        <w:instrText xml:space="preserve"> SEQ ábra \* ARABIC </w:instrText>
+      </w:r>
+      <w:r>
+        <w:fldChar w:fldCharType="separate"/>
+      </w:r>
+      <w:r>
+        <w:rPr>
+          <w:noProof/>
+        </w:rPr>
+        <w:t>7</w:t>
+      </w:r>
+      <w:r>
+        <w:fldChar w:fldCharType="end"/>
+      </w:r>
+      <w:r>
+        <w:t>. ábra</w:t>
+      </w:r>
+      <w:bookmarkEnd w:id="17"/>
+      <w:r>
+        <w:t xml:space="preserve"> Éles környezet GitHub Actions workflow részletei</w:t>
+      </w:r>
+    </w:p>
+    <w:p/>
+    <w:p>
+      <w:pPr>
+        <w:pStyle w:val="Szvegtrzs"/>
+        <w:keepNext/>
+        <w:ind w:left="567" w:firstLine="142"/>
+      </w:pPr>
+      <w:r>
+        <w:t>A másod</w:t>
+      </w:r>
+      <w:r>
+        <w:t xml:space="preserve">ik workflow részleteit a </w:t>
+      </w:r>
+      <w:r>
+        <w:fldChar w:fldCharType="begin"/>
+      </w:r>
+      <w:r>
+        <w:instrText xml:space="preserve"> REF _Ref229390995 \h </w:instrText>
+      </w:r>
+      <w:r>
+        <w:fldChar w:fldCharType="separate"/>
+      </w:r>
+      <w:r>
+        <w:rPr>
+          <w:noProof/>
+        </w:rPr>
+        <w:t>7</w:t>
+      </w:r>
+      <w:r>
+        <w:t>. ábra</w:t>
+      </w:r>
+      <w:r>
+        <w:fldChar w:fldCharType="end"/>
+      </w:r>
+      <w:r>
+        <w:t xml:space="preserve"> szemlélteti. Ez a workflow nagyrészt hasonló a </w:t>
+      </w:r>
+      <w:r>
+        <w:lastRenderedPageBreak/>
+        <w:t xml:space="preserve">development környezethez tartozó verzióhoz, azonban pull request létrehozásakor fut le, és már az éles környezethez készített Dockerfile-okat használja. A sikeresen buildelt image-eket ezt követően feltölti a GitHub Container Registry-be. Ezáltal az éles telepítés során nem szükséges újra buildelni az alkalmazást, elegendő a már </w:t>
+      </w:r>
+      <w:r>
+        <w:t>elkészített image-ek letöltése.</w:t>
+      </w:r>
+      <w:bookmarkStart w:id="18" w:name="_MON_1840003787"/>
+      <w:bookmarkEnd w:id="18"/>
+      <w:r>
+        <w:object w:dxaOrig="9072" w:dyaOrig="5580" w14:anchorId="43FB6512">
+          <v:shape id="_x0000_i1050" type="#_x0000_t75" style="width:453.6pt;height:279pt" o:ole="">
+            <v:imagedata r:id="rId20" o:title=""/>
+          </v:shape>
+          <o:OLEObject Type="Embed" ProgID="Word.OpenDocumentText.12" ShapeID="_x0000_i1050" DrawAspect="Content" ObjectID="_1840009598" r:id="rId21"/>
+        </w:object>
+      </w:r>
+    </w:p>
+    <w:bookmarkStart w:id="19" w:name="_Ref229391100"/>
+    <w:p>
+      <w:pPr>
+        <w:pStyle w:val="Kpalrs"/>
+        <w:jc w:val="center"/>
+      </w:pPr>
+      <w:r>
+        <w:fldChar w:fldCharType="begin"/>
+      </w:r>
+      <w:r>
+        <w:instrText xml:space="preserve"> SEQ ábra \* ARABIC </w:instrText>
+      </w:r>
+      <w:r>
+        <w:fldChar w:fldCharType="separate"/>
+      </w:r>
+      <w:r>
+        <w:rPr>
+          <w:noProof/>
+        </w:rPr>
+        <w:t>8</w:t>
+      </w:r>
+      <w:r>
+        <w:fldChar w:fldCharType="end"/>
+      </w:r>
+      <w:r>
+        <w:t>. ábra</w:t>
+      </w:r>
+      <w:bookmarkEnd w:id="19"/>
+      <w:r>
+        <w:t xml:space="preserve"> Deploy GitHub Actions workflow részletei</w:t>
+      </w:r>
+    </w:p>
+    <w:p/>
+    <w:p>
+      <w:pPr>
+        <w:pStyle w:val="Szvegtrzs"/>
+        <w:ind w:left="567" w:firstLine="142"/>
+      </w:pPr>
+      <w:r>
+        <w:t>A harmadik workflow maga a telepítési folyama</w:t>
+      </w:r>
+      <w:r>
+        <w:t xml:space="preserve">t, amelynek részleteit a </w:t>
+      </w:r>
+      <w:r>
+        <w:fldChar w:fldCharType="begin"/>
+      </w:r>
+      <w:r>
+        <w:instrText xml:space="preserve"> REF _Ref229391100 \h </w:instrText>
+      </w:r>
+      <w:r>
+        <w:fldChar w:fldCharType="separate"/>
+      </w:r>
+      <w:r>
+        <w:rPr>
+          <w:noProof/>
+        </w:rPr>
+        <w:t>8</w:t>
+      </w:r>
+      <w:r>
+        <w:t>. ábra</w:t>
+      </w:r>
+      <w:r>
+        <w:fldChar w:fldCharType="end"/>
+      </w:r>
+      <w:r>
+        <w:t xml:space="preserve"> mutatja. Ez a workflow nem automatikusan, esemény hatására indul el, hanem manuálisan indítható a fejlesztő által. A workflow-t futtató GitHub Actions runner SSH-kapcsolaton keresztül csatlakozik a VPS szerverhez, majd végrehajtja a szükséges telepítési parancsokat. A folyamat része a Docker image-ek letöltése a GitHub Container Registry-ből</w:t>
+      </w:r>
+      <w:r>
+        <w:t>, majd a konténerek elindítása.</w:t>
+      </w:r>
+      <w:r>
+        <w:rPr>
+          <w:noProof/>
+          <w:lang w:eastAsia="hu-HU" w:bidi="ar-SA"/>
+        </w:rPr>
+        <w:t xml:space="preserve"> </w:t>
+      </w:r>
+    </w:p>
+    <w:p>
+      <w:pPr>
+        <w:pStyle w:val="Szvegtrzs"/>
+        <w:ind w:left="567" w:firstLine="142"/>
+      </w:pPr>
+      <w:r>
+        <w:rPr>
+          <w:noProof/>
+        </w:rPr>
+        <w:lastRenderedPageBreak/>
+        <mc:AlternateContent>
+          <mc:Choice Requires="wps">
+            <w:drawing>
+              <wp:anchor distT="0" distB="0" distL="114300" distR="114300" simplePos="0" relativeHeight="251667456" behindDoc="0" locked="0" layoutInCell="1" allowOverlap="1" wp14:anchorId="61FC1E1D" wp14:editId="72F4772D">
+                <wp:simplePos x="0" y="0"/>
+                <wp:positionH relativeFrom="column">
+                  <wp:posOffset>1050925</wp:posOffset>
+                </wp:positionH>
+                <wp:positionV relativeFrom="paragraph">
+                  <wp:posOffset>4238625</wp:posOffset>
+                </wp:positionV>
+                <wp:extent cx="4010025" cy="635"/>
+                <wp:effectExtent l="0" t="0" r="9525" b="6350"/>
+                <wp:wrapTopAndBottom/>
+                <wp:docPr id="9" name="Szövegdoboz 9"/>
+                <wp:cNvGraphicFramePr/>
+                <a:graphic xmlns:a="http://schemas.openxmlformats.org/drawingml/2006/main">
+                  <a:graphicData uri="http://schemas.microsoft.com/office/word/2010/wordprocessingShape">
+                    <wps:wsp>
+                      <wps:cNvSpPr txBox="1"/>
+                      <wps:spPr>
+                        <a:xfrm>
+                          <a:off x="0" y="0"/>
+                          <a:ext cx="4010025" cy="635"/>
+                        </a:xfrm>
+                        <a:prstGeom prst="rect">
+                          <a:avLst/>
+                        </a:prstGeom>
+                        <a:solidFill>
+                          <a:prstClr val="white"/>
+                        </a:solidFill>
+                        <a:ln>
+                          <a:noFill/>
+                        </a:ln>
+                      </wps:spPr>
+                      <wps:txbx>
+                        <w:txbxContent>
+                          <w:bookmarkStart w:id="20" w:name="_Ref229391367"/>
+                          <w:p>
+                            <w:pPr>
+                              <w:pStyle w:val="Kpalrs"/>
+                            </w:pPr>
+                            <w:r>
+                              <w:fldChar w:fldCharType="begin"/>
+                            </w:r>
+                            <w:r>
+                              <w:instrText xml:space="preserve"> SEQ ábra \* ARABIC </w:instrText>
+                            </w:r>
+                            <w:r>
+                              <w:fldChar w:fldCharType="separate"/>
+                            </w:r>
+                            <w:r>
+                              <w:rPr>
+                                <w:noProof/>
+                              </w:rPr>
+                              <w:t>9</w:t>
+                            </w:r>
+                            <w:r>
+                              <w:fldChar w:fldCharType="end"/>
+                            </w:r>
+                            <w:r>
+                              <w:t>. ábra</w:t>
+                            </w:r>
+                            <w:bookmarkEnd w:id="20"/>
+                            <w:r>
+                              <w:t xml:space="preserve"> Release Ready Mainline branch protection szabályai</w:t>
+                            </w:r>
+                          </w:p>
+                          <w:p/>
+                        </w:txbxContent>
+                      </wps:txbx>
+                      <wps:bodyPr rot="0" spcFirstLastPara="0" vertOverflow="overflow" horzOverflow="overflow" vert="horz" wrap="square" lIns="0" tIns="0" rIns="0" bIns="0" numCol="1" spcCol="0" rtlCol="0" fromWordArt="0" anchor="t" anchorCtr="0" forceAA="0" compatLnSpc="1">
+                        <a:prstTxWarp prst="textNoShape">
+                          <a:avLst/>
+                        </a:prstTxWarp>
+                        <a:spAutoFit/>
+                      </wps:bodyPr>
+                    </wps:wsp>
+                  </a:graphicData>
+                </a:graphic>
+                <wp14:sizeRelH relativeFrom="margin">
+                  <wp14:pctWidth>0</wp14:pctWidth>
+                </wp14:sizeRelH>
+              </wp:anchor>
+            </w:drawing>
+          </mc:Choice>
+          <mc:Fallback>
+            <w:pict>
+              <v:shape w14:anchorId="61FC1E1D" id="Szövegdoboz 9" o:spid="_x0000_s1029" type="#_x0000_t202" style="position:absolute;left:0;text-align:left;margin-left:82.75pt;margin-top:333.75pt;width:315.75pt;height:.05pt;z-index:251667456;visibility:visible;mso-wrap-style:square;mso-width-percent:0;mso-wrap-distance-left:9pt;mso-wrap-distance-top:0;mso-wrap-distance-right:9pt;mso-wrap-distance-bottom:0;mso-position-horizontal:absolute;mso-position-horizontal-relative:text;mso-position-vertical:absolute;mso-position-vertical-relative:text;mso-width-percent:0;mso-width-relative:margin;v-text-anchor:top" o:gfxdata="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" stroked="f">
+                <v:textbox style="mso-fit-shape-to-text:t" inset="0,0,0,0">
+                  <w:txbxContent>
+                    <w:bookmarkStart w:id="21" w:name="_Ref229391367"/>
+                    <w:p>
+                      <w:pPr>
+                        <w:pStyle w:val="Kpalrs"/>
+                      </w:pPr>
+                      <w:r>
+                        <w:fldChar w:fldCharType="begin"/>
+                      </w:r>
+                      <w:r>
+                        <w:instrText xml:space="preserve"> SEQ ábra \* ARABIC </w:instrText>
+                      </w:r>
+                      <w:r>
+                        <w:fldChar w:fldCharType="separate"/>
+                      </w:r>
+                      <w:r>
+                        <w:rPr>
+                          <w:noProof/>
+                        </w:rPr>
+                        <w:t>9</w:t>
+                      </w:r>
+                      <w:r>
+                        <w:fldChar w:fldCharType="end"/>
+                      </w:r>
+                      <w:r>
+                        <w:t>. ábra</w:t>
+                      </w:r>
+                      <w:bookmarkEnd w:id="21"/>
+                      <w:r>
+                        <w:t xml:space="preserve"> Release Ready Mainline branch protection szabályai</w:t>
+                      </w:r>
+                    </w:p>
+                    <w:p/>
+                  </w:txbxContent>
+                </v:textbox>
+                <w10:wrap type="topAndBottom"/>
+              </v:shape>
+            </w:pict>
+          </mc:Fallback>
+        </mc:AlternateContent>
+      </w:r>
+      <w:r>
+        <w:drawing>
+          <wp:anchor distT="0" distB="0" distL="114300" distR="114300" simplePos="0" relativeHeight="251652096" behindDoc="0" locked="0" layoutInCell="1" allowOverlap="1" wp14:anchorId="384BB50B" wp14:editId="4050B47D">
+            <wp:simplePos x="0" y="0"/>
+            <wp:positionH relativeFrom="margin">
+              <wp:align>center</wp:align>
+            </wp:positionH>
+            <wp:positionV relativeFrom="paragraph">
+              <wp:posOffset>152400</wp:posOffset>
+            </wp:positionV>
+            <wp:extent cx="3291840" cy="4038600"/>
+            <wp:effectExtent l="0" t="0" r="3810" b="0"/>
+            <wp:wrapTopAndBottom/>
+            <wp:docPr id="4" name="Kép 4"/>
+            <wp:cNvGraphicFramePr>
+              <a:graphicFrameLocks xmlns:a="http://schemas.openxmlformats.org/drawingml/2006/main" noChangeAspect="1"/>
+            </wp:cNvGraphicFramePr>
+            <a:graphic xmlns:a="http://schemas.openxmlformats.org/drawingml/2006/main">
+              <a:graphicData uri="http://schemas.openxmlformats.org/drawingml/2006/picture">
+                <pic:pic xmlns:pic="http://schemas.openxmlformats.org/drawingml/2006/picture">
+                  <pic:nvPicPr>
+                    <pic:cNvPr id="1" name=""/>
+                    <pic:cNvPicPr/>
+                  </pic:nvPicPr>
+                  <pic:blipFill>
+                    <a:blip r:embed="rId22">
+                      <a:extLst>
+                        <a:ext uri="{28A0092B-C50C-407E-A947-70E740481C1C}">
+                          <a14:useLocalDpi xmlns:a14="http://schemas.microsoft.com/office/drawing/2010/main" val="0"/>
+                        </a:ext>
+                      </a:extLst>
+                    </a:blip>
+                    <a:stretch>
+                      <a:fillRect/>
+                    </a:stretch>
+                  </pic:blipFill>
+                  <pic:spPr>
+                    <a:xfrm>
+                      <a:off x="0" y="0"/>
+                      <a:ext cx="3291840" cy="4038600"/>
+                    </a:xfrm>
+                    <a:prstGeom prst="rect">
+                      <a:avLst/>
+                    </a:prstGeom>
+                  </pic:spPr>
+                </pic:pic>
+              </a:graphicData>
+            </a:graphic>
+            <wp14:sizeRelH relativeFrom="margin">
+              <wp14:pctWidth>0</wp14:pctWidth>
+            </wp14:sizeRelH>
+            <wp14:sizeRelV relativeFrom="margin">
+              <wp14:pctHeight>0</wp14:pctHeight>
+            </wp14:sizeRelV>
+          </wp:anchor>
+        </w:drawing>
+      </w:r>
+      <w:r>
+        <w:t xml:space="preserve">A teljes folyamatot a </w:t>
+      </w:r>
+      <w:r>
+        <w:fldChar w:fldCharType="begin"/>
+      </w:r>
+      <w:r>
+        <w:instrText xml:space="preserve"> REF _Ref229391367 \h </w:instrText>
+      </w:r>
+      <w:r>
+        <w:fldChar w:fldCharType="separate"/>
+      </w:r>
+      <w:r>
+        <w:rPr>
+          <w:noProof/>
+        </w:rPr>
+        <w:t>9</w:t>
+      </w:r>
+      <w:r>
+        <w:t>. ábra</w:t>
+      </w:r>
+      <w:r>
+        <w:fldChar w:fldCharType="end"/>
+      </w:r>
+      <w:r>
+        <w:t xml:space="preserve"> által mutatott</w:t>
+      </w:r>
+      <w:r>
+        <w:t xml:space="preserve"> branch protection konfiguráció fogja össze. A projekt során a Release Ready Mainline szemléletet követtem, amelynek lényege, hogy a fejlesztés külön development brancheken történik, míg a main branch kizárólag stabil, kiadásra kész állapotú kódot tartalmazhat. A main branchre közvetlen pusholás nem engedélyezett; módosítás kizárólag pull requesten keresztül kerülhet be. Emellett a merge-hez legalább egy jóváhagyás szükséges, valamint minden kötelező build- és tesztfolyamatnak sikeresen le kell futnia. További feltétel volt, hogy csak aláírt (signed) commitok kerülhessenek a branch történetébe, biztosítva ezzel a commitok hitelességét és</w:t>
+      </w:r>
+      <w:r>
+        <w:t xml:space="preserve"> eredetének ellenőrizhetőségét.</w:t>
+      </w:r>
+    </w:p>
+    <w:p>
+      <w:pPr>
+        <w:pStyle w:val="Szvegtrzs"/>
+        <w:ind w:left="567" w:firstLine="142"/>
+      </w:pPr>
+      <w:r>
+        <w:t>Ennek eredményeként megvalósult a folyamatos szállítás (continuous delivery) alapelve, hiszen a main branch minden időpillanatban egy működőképes, telepíthető projektverziót tartalm</w:t>
+      </w:r>
+      <w:r>
+        <w:t>az</w:t>
+      </w:r>
+      <w:r>
+        <w:t>.</w:t>
+      </w:r>
+    </w:p>
+    <w:p>
+      <w:pPr>
+        <w:pStyle w:val="Cmsor2"/>
+      </w:pPr>
+      <w:r>
+        <w:t>2.4 Deploy</w:t>
+      </w:r>
+    </w:p>
+    <w:p>
+      <w:pPr>
+        <w:pStyle w:val="Szvegtrzs"/>
+        <w:ind w:left="567" w:firstLine="142"/>
+      </w:pPr>
+      <w:r>
+        <w:t>A deploy szakaszban kellett eldöntenem, hogy a backendet tartalmazó konténereket hova hostolom ki.</w:t>
+      </w:r>
     </w:p>
     <w:p>
       <w:pPr>
@@ -2248,203 +2872,312 @@
           <w:ilvl w:val="0"/>
           <w:numId w:val="0"/>
         </w:numPr>
-      </w:pPr>
-      <w:r>
-        <w:t xml:space="preserve">2.2 </w:t>
-      </w:r>
-      <w:r>
-        <w:t>Összefoglalás</w:t>
+        <w:ind w:left="576" w:hanging="576"/>
+      </w:pPr>
+      <w:r>
+        <w:t>2.4.1 A megfelelő VPS kiválasztása</w:t>
       </w:r>
     </w:p>
     <w:p>
       <w:pPr>
         <w:pStyle w:val="Szvegtrzs"/>
-      </w:pPr>
-    </w:p>
-    <w:p>
-      <w:r>
-        <w:t xml:space="preserve">Ebben a részben az </w:t>
-      </w:r>
-      <w:r>
-        <w:rPr>
-          <w:i/>
-        </w:rPr>
-        <w:t>adott</w:t>
-      </w:r>
-      <w:r>
-        <w:t xml:space="preserve"> </w:t>
-      </w:r>
-      <w:r>
-        <w:rPr>
-          <w:i/>
-          <w:iCs/>
-        </w:rPr>
-        <w:t xml:space="preserve">félévre vonatkozó, az Önálló laboratórium tárgy keretében elvégzett munka során </w:t>
-      </w:r>
-      <w:r>
-        <w:t xml:space="preserve">elért </w:t>
-      </w:r>
-      <w:r>
-        <w:rPr>
-          <w:b/>
-          <w:bCs/>
-          <w:i/>
-          <w:iCs/>
-        </w:rPr>
-        <w:t xml:space="preserve">új </w:t>
-      </w:r>
-      <w:r>
-        <w:t xml:space="preserve">eredmények ismételt, vázlatos, </w:t>
-      </w:r>
-      <w:r>
-        <w:rPr>
-          <w:b/>
-          <w:bCs/>
-        </w:rPr>
-        <w:t>tömör</w:t>
-      </w:r>
-      <w:r>
-        <w:t xml:space="preserve"> összefoglalását várjuk, lehetőleg nem felsorolásként. Itt még egyszer ki lehet térni a leglényegesebb eredményekre, valamint a félév során felmerülő nehézségekre, de meg lehet említeni a továbbfejlesztési irányokat, lehetőségeket is.</w:t>
-      </w:r>
-      <w:r>
-        <w:t xml:space="preserve"> </w:t>
-      </w:r>
-    </w:p>
-    <w:p>
-      <w:r>
-        <w:t>Ezt a részt tagolható a következő pontok megválaszolásával:</w:t>
-      </w:r>
-    </w:p>
-    <w:p>
-      <w:pPr>
+        <w:ind w:left="567" w:firstLine="142"/>
+      </w:pPr>
+      <w:r>
+        <w:t>Ebben a szakaszban két lehetséges irány közül választhattam. Az egyik lehetőség a magasabb szintű, Platform as a Se</w:t>
+      </w:r>
+      <w:r>
+        <w:t>rvice (PaaS) megközelítés volt -</w:t>
+      </w:r>
+      <w:r>
+        <w:t xml:space="preserve"> például A</w:t>
+      </w:r>
+      <w:r>
+        <w:t>WS vagy Azure használata -</w:t>
+      </w:r>
+      <w:r>
+        <w:t xml:space="preserve">, ahol a szolgáltató számos konfigurációs feladatot automatizál, illetve támogatást nyújt az infrastruktúra kezelésében. A másik lehetőség az Infrastructure as a Service (IaaS) modell volt, amelyet különböző VPS-szolgáltatók kínálnak. Ebben az esetben lényegében egy </w:t>
+      </w:r>
+      <w:r>
+        <w:lastRenderedPageBreak/>
+        <w:t>üres virtuális szervert kap a felhasználó, amelynek teljes konfigurációját</w:t>
+      </w:r>
+      <w:r>
+        <w:t xml:space="preserve"> saját magának kell elvégeznie.</w:t>
+      </w:r>
+    </w:p>
+    <w:p>
+      <w:pPr>
+        <w:pStyle w:val="Szvegtrzs"/>
+        <w:ind w:left="567" w:firstLine="142"/>
+      </w:pPr>
+      <w:r>
+        <w:t>Végül az IaaS-alapú VPS megoldás mellett döntöttem, mivel szerettem volna Linux-alapú szerverüzemeltetési és szkriptelési tapasztalatot szerezni, emellett költséghatékony megoldást kerestem. A következő lépés a megfelelő VPS-szolgáltató kiválasztása volt. Elsődle</w:t>
+      </w:r>
+      <w:r>
+        <w:t>ges szempontként a teljesítmény-</w:t>
+      </w:r>
+      <w:r>
+        <w:t>ár arányt határoztam meg, míg a rendelkezésre álló tárhely másodlagos szerepet kapott. Bár a .NET Core backend nem végez kifejezetten számításigényes műveleteket, a szervernek egyszerre kellett futtatnia egy PostgreSQL adatbázist, egy .NET Core Web API szolgáltatást, valamint egy Python-alapú AI szolgáltatást is, így a minimálisnál valamivel erősebb hardverre volt szükség. A tárhelyigény ezzel szemben nem volt jelentős, mivel az alkalmazás tömöríti a feltöltött képeket, így azok vis</w:t>
+      </w:r>
+      <w:r>
+        <w:t>zonylag kevés helyet foglalnak.</w:t>
+      </w:r>
+    </w:p>
+    <w:p>
+      <w:pPr>
+        <w:pStyle w:val="Szvegtrzs"/>
+        <w:ind w:left="567" w:firstLine="142"/>
+      </w:pPr>
+      <w:r>
+        <w:t>A választásban nagy segítséget nyújtott egy Medium-cikk,</w:t>
+      </w:r>
+      <w:sdt>
+        <w:sdtPr>
+          <w:id w:val="1641066395"/>
+          <w:citation/>
+        </w:sdtPr>
+        <w:sdtContent>
+          <w:r>
+            <w:fldChar w:fldCharType="begin"/>
+          </w:r>
+          <w:r>
+            <w:instrText xml:space="preserve"> CITATION Ale26 \l 1038 </w:instrText>
+          </w:r>
+          <w:r>
+            <w:fldChar w:fldCharType="separate"/>
+          </w:r>
+          <w:r>
+            <w:rPr>
+              <w:noProof/>
+            </w:rPr>
+            <w:t xml:space="preserve"> </w:t>
+          </w:r>
+          <w:r>
+            <w:rPr>
+              <w:noProof/>
+            </w:rPr>
+            <w:t>[3]</w:t>
+          </w:r>
+          <w:r>
+            <w:fldChar w:fldCharType="end"/>
+          </w:r>
+        </w:sdtContent>
+      </w:sdt>
+      <w:r>
+        <w:t xml:space="preserve"> amely összehasonlította a legkedvezőbb árú hostingmegoldásokat és VPS-szolgáltatókat. Végül a Hetzner szolgáltató mel</w:t>
+      </w:r>
+      <w:r>
+        <w:t>lett döntöttem, mivel a cikk</w:t>
+      </w:r>
+      <w:r>
+        <w:t xml:space="preserve"> szerint ők </w:t>
+      </w:r>
+      <w:r>
+        <w:t>kínálták a legjobb teljesítmény-</w:t>
+      </w:r>
+      <w:r>
+        <w:t>ár arányú szerverkonfigurációkat, emellett a webes kezelőfelületük is f</w:t>
+      </w:r>
+      <w:r>
+        <w:t>elhasználóbarát volt.</w:t>
+      </w:r>
+    </w:p>
+    <w:p>
+      <w:pPr>
+        <w:pStyle w:val="Szvegtrzs"/>
+        <w:ind w:left="567" w:firstLine="142"/>
+      </w:pPr>
+      <w:r>
+        <w:t>A választásom a CPX22 csomagra esett, amely 2 virtuális CPU-magot, 4 GB RAM-ot, 80 GB SSD tárhelyet, 20 TB havi adatforgalmat, valamint publikus IPv4- és IPv6-címet biztosított havi 10,15 € díjért. A beszámoló készítésekor ez körülbelül 3606 forintnak felelt meg. A szolgáltatással kapcsolatban eddig kizárólag pozitív tapasztalataim voltak: használat közben nem tapasztaltam teljesítményproblémát vagy kiesést. Emellett a szolgáltató számos további funkciót is biztosít, például szerver-átméretezést vagy load balancing megoldásokat, amelyek lehetőséget adnak a rendszer későbbi bővítésére és skálázására.</w:t>
+      </w:r>
+    </w:p>
+    <w:p>
+      <w:pPr>
+        <w:pStyle w:val="Cmsor2"/>
         <w:numPr>
           <w:ilvl w:val="0"/>
-          <w:numId w:val="6"/>
+          <w:numId w:val="0"/>
         </w:numPr>
-      </w:pPr>
-      <w:r>
-        <w:t xml:space="preserve">Mi volt az aktuális kérdés, </w:t>
-      </w:r>
-      <w:r>
-        <w:rPr>
-          <w:b/>
-        </w:rPr>
-        <w:t>probléma,</w:t>
-      </w:r>
-      <w:r>
-        <w:t xml:space="preserve"> amivel a </w:t>
-      </w:r>
-      <w:r>
-        <w:t xml:space="preserve">félév során </w:t>
-      </w:r>
-      <w:r>
-        <w:t>foglalkoztál</w:t>
-      </w:r>
-      <w:r>
-        <w:t>?</w:t>
-      </w:r>
-    </w:p>
-    <w:p>
-      <w:pPr>
+        <w:ind w:left="576" w:hanging="576"/>
+      </w:pPr>
+      <w:r>
+        <w:t>2.4.</w:t>
+      </w:r>
+      <w:r>
+        <w:t>2</w:t>
+      </w:r>
+      <w:r>
+        <w:t xml:space="preserve"> </w:t>
+      </w:r>
+      <w:r>
+        <w:t>Backend konténerek telepítése a VPS -re</w:t>
+      </w:r>
+    </w:p>
+    <w:p>
+      <w:pPr>
+        <w:pStyle w:val="Szvegtrzs"/>
+        <w:ind w:left="567" w:firstLine="142"/>
+      </w:pPr>
+      <w:r>
+        <w:t>A konténerek telepítése a kezdeti szerverkonfiguráció után már viszonylag egyszerű folyamat volt. A kezdeti konfiguráció során azokat az alapvető lépéseket végeztem el, amelyeket általában egy üres VPS-szerver hosting célú használata előtt szükséges beállítani. Elsőként konfiguráltam az SSH-hozzáférést annak érdekében, hogy ne kizárólag a Hetzner webes felületéről tudjak csatlakozni a szerverhez, hanem k</w:t>
+      </w:r>
+      <w:r>
+        <w:t>özvetlenül a saját gépemről is.</w:t>
+      </w:r>
+    </w:p>
+    <w:p>
+      <w:pPr>
+        <w:pStyle w:val="Szvegtrzs"/>
+        <w:ind w:left="567" w:firstLine="142"/>
+      </w:pPr>
+      <w:r>
+        <w:t>Ezt követően a tűzfalbeállításokat konfiguráltam: minden bejövő forgalmat letiltottam, kivéve a működéshez szükséges SSH, HTTP és HTTPS portokat. Emellett beállítottam az NGINX webszervert is, amely reverse proxyként működik, és ezen keresztül éri el a mobi</w:t>
+      </w:r>
+      <w:r>
+        <w:t>lalkalmazás az API-végpontokat.</w:t>
+      </w:r>
+    </w:p>
+    <w:p>
+      <w:pPr>
+        <w:pStyle w:val="Szvegtrzs"/>
+        <w:ind w:left="567" w:firstLine="142"/>
+      </w:pPr>
+      <w:r>
+        <w:t xml:space="preserve">A publikus </w:t>
+      </w:r>
+      <w:r>
+        <w:t xml:space="preserve">elérés biztosításához a DuckDNS </w:t>
+      </w:r>
+      <w:r>
+        <w:t>szolgáltatás segítségével szereztem egy ingyenes domainnevet. Ezt követően a Certbot használatával TLS-tanúsítványt állítottam ki a domainhez, így az alkalmazás és a webszerver közötti kommunikáció má</w:t>
+      </w:r>
+      <w:r>
+        <w:t>r HTTPS titkosítással történik.</w:t>
+      </w:r>
+    </w:p>
+    <w:p>
+      <w:pPr>
+        <w:pStyle w:val="Szvegtrzs"/>
+        <w:ind w:left="567" w:firstLine="142"/>
+      </w:pPr>
+      <w:r>
+        <w:t>A konfiguráció elvégzése után az új verziók telepítése jelentősen leegyszerűsödött. Egy új kiadás publikálásához elegendő elin</w:t>
+      </w:r>
+      <w:r>
+        <w:t xml:space="preserve">dítani a </w:t>
+      </w:r>
+      <w:hyperlink w:anchor="_2.3.2_Docker_konténerek" w:history="1">
+        <w:r>
+          <w:rPr>
+            <w:rStyle w:val="Hiperhivatkozs"/>
+          </w:rPr>
+          <w:t>2.3.2</w:t>
+        </w:r>
+      </w:hyperlink>
+      <w:r>
+        <w:t>-es fejezetben</w:t>
+      </w:r>
+      <w:r>
+        <w:t xml:space="preserve"> ismertetett GitHub Actions deploy workflow-t, amely automatikusan végrehajtja a szükséges telepítési lépéseket a VPS szerveren.</w:t>
+      </w:r>
+    </w:p>
+    <w:p>
+      <w:pPr>
+        <w:pStyle w:val="Cmsor2"/>
         <w:numPr>
           <w:ilvl w:val="0"/>
-          <w:numId w:val="6"/>
+          <w:numId w:val="0"/>
         </w:numPr>
       </w:pPr>
       <w:r>
-        <w:t xml:space="preserve">Mi a dolgozat </w:t>
-      </w:r>
-      <w:r>
-        <w:rPr>
-          <w:b/>
-        </w:rPr>
-        <w:t>célja</w:t>
-      </w:r>
-      <w:r>
-        <w:t>, miért érdekes egyáltalán ezzel a problémával foglalkozni</w:t>
-      </w:r>
-      <w:r>
-        <w:t>?</w:t>
-      </w:r>
-    </w:p>
-    <w:p>
-      <w:pPr>
-        <w:numPr>
-          <w:ilvl w:val="0"/>
-          <w:numId w:val="6"/>
-        </w:numPr>
-      </w:pPr>
-      <w:r>
-        <w:t xml:space="preserve">Milyen </w:t>
-      </w:r>
-      <w:r>
-        <w:rPr>
-          <w:b/>
-        </w:rPr>
-        <w:t>módszerek</w:t>
-      </w:r>
-      <w:r>
-        <w:rPr>
-          <w:b/>
-        </w:rPr>
-        <w:t>et</w:t>
-      </w:r>
-      <w:r>
-        <w:t xml:space="preserve"> használtál a probléma megoldása érdekében</w:t>
-      </w:r>
-      <w:r>
-        <w:t>?</w:t>
-      </w:r>
-    </w:p>
-    <w:p>
-      <w:pPr>
-        <w:numPr>
-          <w:ilvl w:val="0"/>
-          <w:numId w:val="6"/>
-        </w:numPr>
-      </w:pPr>
-      <w:r>
-        <w:t xml:space="preserve">Mik a legfontosabb </w:t>
-      </w:r>
-      <w:r>
-        <w:rPr>
-          <w:b/>
-        </w:rPr>
-        <w:t>eredmények</w:t>
-      </w:r>
-      <w:r>
-        <w:t>?</w:t>
-      </w:r>
-    </w:p>
-    <w:p>
-      <w:pPr>
-        <w:numPr>
-          <w:ilvl w:val="0"/>
-          <w:numId w:val="6"/>
-        </w:numPr>
-      </w:pPr>
-      <w:r>
-        <w:t xml:space="preserve">Milyen </w:t>
-      </w:r>
-      <w:r>
-        <w:rPr>
-          <w:b/>
-        </w:rPr>
-        <w:t>következtetéseket</w:t>
-      </w:r>
-      <w:r>
-        <w:t xml:space="preserve"> lehet levonni?</w:t>
-      </w:r>
-    </w:p>
-    <w:p>
-      <w:r>
-        <w:t>Ha valaki elolvassa ezt a részt, képet kell kapnia az egész dolgozatról!</w:t>
-      </w:r>
-    </w:p>
-    <w:p/>
-    <w:p>
-      <w:r>
-        <w:t>Fontos, hogy az itt megadott sablontól el lehet térni, használata nem kötelező, csak segítséget jelenthet, viszont a fedőlap lehetőleg maradjon ugyanez és tartalmilag egyezzen meg a sablon irányelveivel. A beszámoló felépítésében nem érdemes eltérni a Bevezető - Féléves munka és eredmények bemutatása - Összefoglaló hármastól.</w:t>
+        <w:t>2.5</w:t>
+      </w:r>
+      <w:r>
+        <w:t xml:space="preserve"> </w:t>
+      </w:r>
+      <w:r>
+        <w:t>Összefoglalás</w:t>
+      </w:r>
+    </w:p>
+    <w:p>
+      <w:pPr>
+        <w:ind w:left="567" w:firstLine="142"/>
+      </w:pPr>
+      <w:r>
+        <w:t>Az önálló laboratórium során modelleztem egy agilis szoftverfejlesztési életciklus több fontos szakaszát. Foglalkoztam a projekt feladatkövetési rendszerének fejlesztésével, az agilis módon felmerülő új funkciók implementálásával, a backend komponensek konténerizálásával, valamint az erre épülő CI/CD pipeline kialakításával. Emellett kiválasztottam egy, a projekt igényeinek megfelelő és költséghatékony VPS-szolgáltatót, majd megvalósítottam a backend</w:t>
+      </w:r>
+      <w:r>
+        <w:t>,</w:t>
+      </w:r>
+      <w:r>
+        <w:t xml:space="preserve"> </w:t>
+      </w:r>
+      <w:r>
+        <w:lastRenderedPageBreak/>
+        <w:t xml:space="preserve">szerverre történő </w:t>
+      </w:r>
+      <w:r>
+        <w:t>telepítését is.</w:t>
+      </w:r>
+    </w:p>
+    <w:p>
+      <w:pPr>
+        <w:ind w:left="567" w:firstLine="142"/>
+      </w:pPr>
+      <w:r>
+        <w:t>A projekt jelenlegi állapotát az év eleji verzióval összehasonlítva egyértelmű fejlődés figyelhető meg szinte minden területen. A rendszer minősége jelentősen javult, emellett a különböző automatizációs és támogató megoldásoknak köszönhetően a fejlesztési folyamat is kényelmesebbé és hatékonyabbá vált. Személyes célomat is sikerült elérnem, hiszen a backend szolgáltatásokat sikeresen kitelepítettem egy nyilvánosan elérhető szerverre, amelyet a mobilalkalmazás már biztonságos HTTPS-kapcsolaton ke</w:t>
+      </w:r>
+      <w:r>
+        <w:t>resztül bárhonnan képes elérni.</w:t>
+      </w:r>
+    </w:p>
+    <w:p>
+      <w:pPr>
+        <w:ind w:left="567" w:firstLine="142"/>
+      </w:pPr>
+      <w:r>
+        <w:t>Továbbfejlesztési irányként elsősorban a frontend fejlesztői környezet konténerizálását, valamint egy automatikus APK-build folyamat kialakítását tartom fontosnak, amely pull request létrehozásakor automatikusan elkészítené az alkalmazás telepíthető verzióját. Ez jelentős segítséget nyújtana az új eszközökön történő fejlesztés és tesztelés során, mivel a tapasztalataim alapján a backend környezet megfelelő konfigurálása után leginkább a frontend fejlesztői környeze</w:t>
+      </w:r>
+      <w:r>
+        <w:t>t beállítása okozott problémát.</w:t>
+      </w:r>
+    </w:p>
+    <w:p>
+      <w:pPr>
+        <w:ind w:left="567" w:firstLine="142"/>
+      </w:pPr>
+      <w:r>
+        <w:t>A frontend oldalon React Native technológiát használok Expo bundlerrel, amely számos hasznos funkciót biztosít, ugyanakkor jóval összetettebb és rugalmasabban konfigurálható környezetet jelent, mint a backend</w:t>
+      </w:r>
+      <w:r>
+        <w:t xml:space="preserve"> oldali .NET Core szolgáltatás</w:t>
+      </w:r>
+      <w:r>
+        <w:t>. Emiatt a fejlesztői környezet beállítása több ponton is hibalehetőséget hordoz magában. Az Expo és a különböző SDK-verziók kezelése tovább növeli a rendszer komplexitását, ezért egy megfelelően működő frontend konténerkörnyezet kialakítása összetett feladat lenne. Ugyanakkor ennek sikeres megvalósítása jelentősen gyorsítaná és egyszerűs</w:t>
+      </w:r>
+      <w:r>
+        <w:t>ítené a fejlesztési folyamatot.</w:t>
+      </w:r>
+    </w:p>
+    <w:p>
+      <w:pPr>
+        <w:ind w:left="567" w:firstLine="142"/>
+      </w:pPr>
+      <w:r>
+        <w:t>Összességében az önálló laboratórium rendkívül hasznos tapasztalatot jelentett számomra. Úgy érzem, olyan területeken szere</w:t>
+      </w:r>
+      <w:r>
+        <w:t>ztem értékes gyakorlati tudást -</w:t>
+      </w:r>
+      <w:r>
+        <w:t xml:space="preserve"> különösen az agilis fejlesztés, a DevOps és az in</w:t>
+      </w:r>
+      <w:r>
+        <w:t>frastruktúra-kezelés területén -</w:t>
+      </w:r>
+      <w:r>
+        <w:t>, amelyek sok fejlesztő számára nehézséget jelenthetnek. Ezek a tapasztalatok várhatóan a jövőbeni projektjeim során is jelentős segítséget nyújtanak majd.</w:t>
       </w:r>
     </w:p>
     <w:p>
@@ -2456,11 +3189,11 @@
     <w:p>
       <w:pPr>
         <w:sectPr>
-          <w:headerReference w:type="default" r:id="rId16"/>
-          <w:footerReference w:type="even" r:id="rId17"/>
-          <w:footerReference w:type="default" r:id="rId18"/>
-          <w:headerReference w:type="first" r:id="rId19"/>
-          <w:footerReference w:type="first" r:id="rId20"/>
+          <w:headerReference w:type="default" r:id="rId23"/>
+          <w:footerReference w:type="even" r:id="rId24"/>
+          <w:footerReference w:type="default" r:id="rId25"/>
+          <w:headerReference w:type="first" r:id="rId26"/>
+          <w:footerReference w:type="first" r:id="rId27"/>
           <w:pgSz w:w="11906" w:h="16838"/>
           <w:pgMar w:top="1710" w:right="1134" w:bottom="1710" w:left="1134" w:header="1134" w:footer="1134" w:gutter="0"/>
           <w:pgNumType w:start="1"/>
@@ -2475,7 +3208,12 @@
       </w:pPr>
       <w:r>
         <w:lastRenderedPageBreak/>
-        <w:t>Irodalom, és csatlakozó dokumentumok jegyzéke</w:t>
+        <w:t>Iro</w:t>
+      </w:r>
+      <w:bookmarkStart w:id="22" w:name="_GoBack"/>
+      <w:bookmarkEnd w:id="22"/>
+      <w:r>
+        <w:t>dalom, és csatlakozó dokumentumok jegyzéke</w:t>
       </w:r>
     </w:p>
     <w:p>
@@ -2691,15 +3429,7 @@
                       <w:rPr>
                         <w:noProof/>
                       </w:rPr>
-                      <w:t xml:space="preserve">GitLab, „What is </w:t>
-                    </w:r>
-                    <w:bookmarkStart w:id="14" w:name="_GoBack"/>
-                    <w:bookmarkEnd w:id="14"/>
-                    <w:r>
-                      <w:rPr>
-                        <w:noProof/>
-                      </w:rPr>
-                      <w:t>CI/CD?,” [Online]. Available: https://about.gitlab.com/topics/ci-cd/. [Hozzáférés dátuma: 10 május 2026].</w:t>
+                      <w:t>GitLab, „What is CI/CD?,” [Online]. Available: https://about.gitlab.com/topics/ci-cd/. [Hozzáférés dátuma: 10 május 2026].</w:t>
                     </w:r>
                   </w:p>
                 </w:tc>
@@ -2727,45 +3457,13 @@
         </w:sdt>
       </w:sdtContent>
     </w:sdt>
-    <w:p>
-      <w:pPr>
-        <w:pStyle w:val="Cmsor2"/>
-      </w:pPr>
-    </w:p>
-    <w:p>
-      <w:pPr>
-        <w:pStyle w:val="Szvegtrzs"/>
-      </w:pPr>
-    </w:p>
-    <w:p>
-      <w:pPr>
-        <w:pStyle w:val="Cmsor2"/>
-      </w:pPr>
-      <w:r>
-        <w:t>Csatlakozó egyéb elkészült dokumentációk / fájlok / stb. jegyzéke:</w:t>
-      </w:r>
-    </w:p>
-    <w:p>
-      <w:pPr>
-        <w:pStyle w:val="Szvegtrzs"/>
-      </w:pPr>
-      <w:r>
-        <w:t>&lt;A munka ezen beszámolóba be nem fért eredményeinek (pl. forrás fájlok</w:t>
-      </w:r>
-      <w:r>
-        <w:t xml:space="preserve">, mindenképpen csatolni akart forráskód részlet, </w:t>
-      </w:r>
-      <w:r>
-        <w:t>felhasználói leírások, programozói leírások (API), stb.) megnevezése, fellelhetőségi helyének pontos definíciója, mely alapján a az erőforrás előkereshető – értelemszerűen nem nyilvános dokumentumok hivatkozása nem elfogadható.&gt;</w:t>
-      </w:r>
-    </w:p>
     <w:sectPr>
-      <w:headerReference w:type="even" r:id="rId21"/>
-      <w:headerReference w:type="default" r:id="rId22"/>
-      <w:footerReference w:type="even" r:id="rId23"/>
-      <w:footerReference w:type="default" r:id="rId24"/>
-      <w:headerReference w:type="first" r:id="rId25"/>
-      <w:footerReference w:type="first" r:id="rId26"/>
+      <w:headerReference w:type="even" r:id="rId28"/>
+      <w:headerReference w:type="default" r:id="rId29"/>
+      <w:footerReference w:type="even" r:id="rId30"/>
+      <w:footerReference w:type="default" r:id="rId31"/>
+      <w:headerReference w:type="first" r:id="rId32"/>
+      <w:footerReference w:type="first" r:id="rId33"/>
       <w:pgSz w:w="11906" w:h="16838"/>
       <w:pgMar w:top="1710" w:right="1134" w:bottom="1710" w:left="1134" w:header="1134" w:footer="1134" w:gutter="0"/>
       <w:cols w:space="720"/>
@@ -2818,7 +3516,7 @@
       <w:rPr>
         <w:noProof/>
       </w:rPr>
-      <w:t>8</w:t>
+      <w:t>1</w:t>
     </w:r>
     <w:r>
       <w:fldChar w:fldCharType="end"/>
@@ -2858,7 +3556,7 @@
       <w:rPr>
         <w:noProof/>
       </w:rPr>
-      <w:t>9</w:t>
+      <w:t>15</w:t>
     </w:r>
     <w:r>
       <w:fldChar w:fldCharType="end"/>
@@ -2899,7 +3597,10 @@
       <w:pStyle w:val="lfej"/>
     </w:pPr>
     <w:r>
-      <w:t>Beszámoló Péter (BPOX43)</w:t>
+      <w:t>Horváth Gellért (BFK4J4</w:t>
+    </w:r>
+    <w:r>
+      <w:t>)</w:t>
     </w:r>
     <w:r>
       <w:tab/>
@@ -2909,7 +3610,7 @@
       <w:t>20</w:t>
     </w:r>
     <w:r>
-      <w:t>25</w:t>
+      <w:t>26</w:t>
     </w:r>
     <w:r>
       <w:t>-</w:t>
@@ -2918,7 +3619,7 @@
       <w:t>05</w:t>
     </w:r>
     <w:r>
-      <w:t>-05</w:t>
+      <w:t>-10</w:t>
     </w:r>
   </w:p>
 </w:hdr>
@@ -2943,17 +3644,14 @@
       <w:pStyle w:val="lfej"/>
     </w:pPr>
     <w:r>
-      <w:t>Beszámoló Péter (BPOX43)</w:t>
+      <w:t>Horváth Gellért (BFK4J4)</w:t>
     </w:r>
     <w:r>
       <w:tab/>
     </w:r>
     <w:r>
       <w:tab/>
-      <w:t>2017</w:t>
-    </w:r>
-    <w:r>
-      <w:t>-11-05</w:t>
+      <w:t>2026-05-10</w:t>
     </w:r>
   </w:p>
 </w:hdr>
@@ -4635,7 +5333,7 @@
     <b:MonthAccessed>május</b:MonthAccessed>
     <b:DayAccessed>10</b:DayAccessed>
     <b:URL>https://medium.com/@velinxs/best-cheap-vps-hosting-in-2026-under-5-month-picks-that-work-719810d47ba9</b:URL>
-    <b:RefOrder>2</b:RefOrder>
+    <b:RefOrder>3</b:RefOrder>
   </b:Source>
   <b:Source>
     <b:Tag>Git26</b:Tag>
@@ -4655,13 +5353,13 @@
     <b:MonthAccessed>május</b:MonthAccessed>
     <b:DayAccessed>10</b:DayAccessed>
     <b:URL>https://about.gitlab.com/topics/ci-cd/</b:URL>
-    <b:RefOrder>3</b:RefOrder>
+    <b:RefOrder>2</b:RefOrder>
   </b:Source>
 </b:Sources>
 </file>
 
 <file path=customXml/itemProps1.xml><?xml version="1.0" encoding="utf-8"?>
-<ds:datastoreItem xmlns:ds="http://schemas.openxmlformats.org/officeDocument/2006/customXml" ds:itemID="{F22AC544-DEEB-4F06-ACFB-18EE91FF69C3}">
+<ds:datastoreItem xmlns:ds="http://schemas.openxmlformats.org/officeDocument/2006/customXml" ds:itemID="{2D4AC074-CACA-4351-B4A6-A54C577843F2}">
   <ds:schemaRefs>
     <ds:schemaRef ds:uri="http://schemas.openxmlformats.org/officeDocument/2006/bibliography"/>
   </ds:schemaRefs>

</xml_diff>